<commit_message>
feat: fill cards from template placeholders
</commit_message>
<xml_diff>
--- a/templates/information_card.docx
+++ b/templates/information_card.docx
@@ -25,9 +25,9 @@
       </w:tblPr>
       <w:tblGrid>
         <w:gridCol w:w="1420"/>
-        <w:gridCol w:w="240"/>
-        <w:gridCol w:w="2600"/>
-        <w:gridCol w:w="2145"/>
+        <w:gridCol w:w="1756"/>
+        <w:gridCol w:w="1160"/>
+        <w:gridCol w:w="2069"/>
         <w:gridCol w:w="2117"/>
       </w:tblGrid>
       <w:tr>
@@ -119,19 +119,35 @@
         </w:tc>
         <w:tc>
           <w:tcPr>
-            <w:tcW w:w="240" w:type="dxa"/>
-          </w:tcPr>
-          <w:p>
-            <w:pPr>
-              <w:rPr>
-                <w:vertAlign w:val="baseline"/>
-              </w:rPr>
-            </w:pPr>
-          </w:p>
-        </w:tc>
-        <w:tc>
-          <w:tcPr>
-            <w:tcW w:w="2600" w:type="dxa"/>
+            <w:tcW w:w="1756" w:type="dxa"/>
+          </w:tcPr>
+          <w:p>
+            <w:pPr>
+              <w:rPr>
+                <w:vertAlign w:val="baseline"/>
+              </w:rPr>
+            </w:pPr>
+            <w:r>
+              <w:rPr>
+                <w:rFonts w:hint="eastAsia" w:ascii="等线" w:hAnsi="等线" w:eastAsia="等线" w:cs="等线"/>
+                <w:b/>
+                <w:bCs/>
+                <w:i w:val="0"/>
+                <w:iCs w:val="0"/>
+                <w:color w:val="000000"/>
+                <w:kern w:val="0"/>
+                <w:sz w:val="18"/>
+                <w:szCs w:val="18"/>
+                <w:u w:val="none"/>
+                <w:lang w:val="en-US" w:eastAsia="zh-CN" w:bidi="ar"/>
+              </w:rPr>
+              <w:t>&lt;xm&gt;</w:t>
+            </w:r>
+          </w:p>
+        </w:tc>
+        <w:tc>
+          <w:tcPr>
+            <w:tcW w:w="1160" w:type="dxa"/>
           </w:tcPr>
           <w:p>
             <w:pPr>
@@ -153,14 +169,30 @@
         </w:tc>
         <w:tc>
           <w:tcPr>
-            <w:tcW w:w="2145" w:type="dxa"/>
-          </w:tcPr>
-          <w:p>
-            <w:pPr>
-              <w:rPr>
-                <w:vertAlign w:val="baseline"/>
-              </w:rPr>
-            </w:pPr>
+            <w:tcW w:w="2069" w:type="dxa"/>
+          </w:tcPr>
+          <w:p>
+            <w:pPr>
+              <w:rPr>
+                <w:vertAlign w:val="baseline"/>
+              </w:rPr>
+            </w:pPr>
+            <w:r>
+              <w:rPr>
+                <w:rFonts w:hint="eastAsia" w:ascii="等线" w:hAnsi="等线" w:eastAsia="等线" w:cs="等线"/>
+                <w:b/>
+                <w:bCs/>
+                <w:i w:val="0"/>
+                <w:iCs w:val="0"/>
+                <w:color w:val="000000"/>
+                <w:kern w:val="0"/>
+                <w:sz w:val="18"/>
+                <w:szCs w:val="18"/>
+                <w:u w:val="none"/>
+                <w:lang w:val="en-US" w:eastAsia="zh-CN" w:bidi="ar"/>
+              </w:rPr>
+              <w:t>&lt;hgh&gt;</w:t>
+            </w:r>
           </w:p>
         </w:tc>
         <w:tc>
@@ -171,18 +203,25 @@
           <w:p>
             <w:pPr>
               <w:rPr>
-                <w:rFonts w:hint="eastAsia" w:eastAsiaTheme="minorEastAsia"/>
-                <w:vertAlign w:val="baseline"/>
-                <w:lang w:val="en-US" w:eastAsia="zh-CN"/>
-              </w:rPr>
-            </w:pPr>
-            <w:r>
-              <w:rPr>
-                <w:rFonts w:hint="eastAsia"/>
-                <w:vertAlign w:val="baseline"/>
-                <w:lang w:val="en-US" w:eastAsia="zh-CN"/>
-              </w:rPr>
-              <w:t>大头像</w:t>
+                <w:rFonts w:hint="default" w:eastAsiaTheme="minorEastAsia"/>
+                <w:vertAlign w:val="baseline"/>
+                <w:lang w:val="en-US" w:eastAsia="zh-CN"/>
+              </w:rPr>
+            </w:pPr>
+            <w:r>
+              <w:rPr>
+                <w:rFonts w:hint="eastAsia" w:ascii="等线" w:hAnsi="等线" w:eastAsia="等线" w:cs="等线"/>
+                <w:b/>
+                <w:bCs/>
+                <w:i w:val="0"/>
+                <w:iCs w:val="0"/>
+                <w:color w:val="000000"/>
+                <w:sz w:val="18"/>
+                <w:szCs w:val="18"/>
+                <w:u w:val="none"/>
+                <w:lang w:val="en-US" w:eastAsia="zh-CN"/>
+              </w:rPr>
+              <w:t>&lt;dtz&gt;</w:t>
             </w:r>
           </w:p>
         </w:tc>
@@ -237,6 +276,22 @@
                 <w:vertAlign w:val="baseline"/>
               </w:rPr>
             </w:pPr>
+            <w:r>
+              <w:rPr>
+                <w:rFonts w:hint="eastAsia" w:ascii="等线" w:hAnsi="等线" w:eastAsia="等线" w:cs="等线"/>
+                <w:b/>
+                <w:bCs/>
+                <w:i w:val="0"/>
+                <w:iCs w:val="0"/>
+                <w:color w:val="000000"/>
+                <w:kern w:val="0"/>
+                <w:sz w:val="18"/>
+                <w:szCs w:val="18"/>
+                <w:u w:val="none"/>
+                <w:lang w:val="en-US" w:eastAsia="zh-CN" w:bidi="ar"/>
+              </w:rPr>
+              <w:t>&lt;xmmc&gt;</w:t>
+            </w:r>
           </w:p>
         </w:tc>
         <w:tc>
@@ -303,6 +358,14 @@
                 <w:vertAlign w:val="baseline"/>
               </w:rPr>
             </w:pPr>
+            <w:r>
+              <w:rPr>
+                <w:rStyle w:val="5"/>
+                <w:rFonts w:hint="eastAsia"/>
+                <w:lang w:val="en-US" w:eastAsia="zh-CN" w:bidi="ar"/>
+              </w:rPr>
+              <w:t>&lt;dw&gt;</w:t>
+            </w:r>
           </w:p>
         </w:tc>
         <w:tc>
@@ -369,9 +432,19 @@
           <w:p>
             <w:pPr>
               <w:rPr>
-                <w:vertAlign w:val="baseline"/>
-              </w:rPr>
-            </w:pPr>
+                <w:rFonts w:hint="default" w:eastAsiaTheme="minorEastAsia"/>
+                <w:vertAlign w:val="baseline"/>
+                <w:lang w:val="en-US" w:eastAsia="zh-CN"/>
+              </w:rPr>
+            </w:pPr>
+            <w:r>
+              <w:rPr>
+                <w:rFonts w:hint="eastAsia"/>
+                <w:vertAlign w:val="baseline"/>
+                <w:lang w:val="en-US" w:eastAsia="zh-CN"/>
+              </w:rPr>
+              <w:t>&lt;qy&gt;</w:t>
+            </w:r>
           </w:p>
         </w:tc>
         <w:tc>
@@ -435,9 +508,19 @@
           <w:p>
             <w:pPr>
               <w:rPr>
-                <w:vertAlign w:val="baseline"/>
-              </w:rPr>
-            </w:pPr>
+                <w:rFonts w:hint="default" w:eastAsiaTheme="minorEastAsia"/>
+                <w:vertAlign w:val="baseline"/>
+                <w:lang w:val="en-US" w:eastAsia="zh-CN"/>
+              </w:rPr>
+            </w:pPr>
+            <w:r>
+              <w:rPr>
+                <w:rFonts w:hint="eastAsia"/>
+                <w:vertAlign w:val="baseline"/>
+                <w:lang w:val="en-US" w:eastAsia="zh-CN"/>
+              </w:rPr>
+              <w:t>&lt;sfz&gt;</w:t>
+            </w:r>
           </w:p>
         </w:tc>
         <w:tc>
@@ -501,9 +584,19 @@
           <w:p>
             <w:pPr>
               <w:rPr>
-                <w:vertAlign w:val="baseline"/>
-              </w:rPr>
-            </w:pPr>
+                <w:rFonts w:hint="default" w:eastAsiaTheme="minorEastAsia"/>
+                <w:vertAlign w:val="baseline"/>
+                <w:lang w:val="en-US" w:eastAsia="zh-CN"/>
+              </w:rPr>
+            </w:pPr>
+            <w:r>
+              <w:rPr>
+                <w:rFonts w:hint="eastAsia"/>
+                <w:vertAlign w:val="baseline"/>
+                <w:lang w:val="en-US" w:eastAsia="zh-CN"/>
+              </w:rPr>
+              <w:t>&lt;sj&gt;</w:t>
+            </w:r>
           </w:p>
         </w:tc>
         <w:tc>
@@ -570,9 +663,19 @@
           <w:p>
             <w:pPr>
               <w:rPr>
-                <w:vertAlign w:val="baseline"/>
-              </w:rPr>
-            </w:pPr>
+                <w:rFonts w:hint="default" w:eastAsiaTheme="minorEastAsia"/>
+                <w:vertAlign w:val="baseline"/>
+                <w:lang w:val="en-US" w:eastAsia="zh-CN"/>
+              </w:rPr>
+            </w:pPr>
+            <w:r>
+              <w:rPr>
+                <w:rFonts w:hint="eastAsia"/>
+                <w:vertAlign w:val="baseline"/>
+                <w:lang w:val="en-US" w:eastAsia="zh-CN"/>
+              </w:rPr>
+              <w:t>&lt;ksxm&gt;</w:t>
+            </w:r>
           </w:p>
         </w:tc>
         <w:tc>
@@ -642,59 +745,22 @@
                 <w:vertAlign w:val="baseline"/>
               </w:rPr>
             </w:pPr>
-          </w:p>
-        </w:tc>
-      </w:tr>
-      <w:tr>
-        <w:tblPrEx>
-          <w:tblBorders>
-            <w:top w:val="single" w:color="auto" w:sz="4" w:space="0"/>
-            <w:left w:val="single" w:color="auto" w:sz="4" w:space="0"/>
-            <w:bottom w:val="single" w:color="auto" w:sz="4" w:space="0"/>
-            <w:right w:val="single" w:color="auto" w:sz="4" w:space="0"/>
-            <w:insideH w:val="single" w:color="auto" w:sz="4" w:space="0"/>
-            <w:insideV w:val="single" w:color="auto" w:sz="4" w:space="0"/>
-          </w:tblBorders>
-          <w:tblCellMar>
-            <w:top w:w="0" w:type="dxa"/>
-            <w:left w:w="108" w:type="dxa"/>
-            <w:bottom w:w="0" w:type="dxa"/>
-            <w:right w:w="108" w:type="dxa"/>
-          </w:tblCellMar>
-        </w:tblPrEx>
-        <w:tc>
-          <w:tcPr>
-            <w:tcW w:w="1420" w:type="dxa"/>
-          </w:tcPr>
-          <w:p>
-            <w:pPr>
-              <w:rPr>
-                <w:rFonts w:hint="default" w:eastAsiaTheme="minorEastAsia"/>
-                <w:vertAlign w:val="baseline"/>
-                <w:lang w:val="en-US" w:eastAsia="zh-CN"/>
-              </w:rPr>
-            </w:pPr>
-            <w:r>
-              <w:rPr>
-                <w:rFonts w:hint="eastAsia"/>
-                <w:vertAlign w:val="baseline"/>
-                <w:lang w:val="en-US" w:eastAsia="zh-CN"/>
-              </w:rPr>
-              <w:t>证件有效期</w:t>
-            </w:r>
-          </w:p>
-        </w:tc>
-        <w:tc>
-          <w:tcPr>
-            <w:tcW w:w="7102" w:type="dxa"/>
-            <w:gridSpan w:val="4"/>
-          </w:tcPr>
-          <w:p>
-            <w:pPr>
-              <w:rPr>
-                <w:vertAlign w:val="baseline"/>
-              </w:rPr>
-            </w:pPr>
+            <w:r>
+              <w:rPr>
+                <w:rFonts w:hint="eastAsia" w:ascii="等线" w:hAnsi="等线" w:eastAsia="等线" w:cs="等线"/>
+                <w:b/>
+                <w:bCs/>
+                <w:i w:val="0"/>
+                <w:iCs w:val="0"/>
+                <w:color w:val="000000"/>
+                <w:kern w:val="0"/>
+                <w:sz w:val="18"/>
+                <w:szCs w:val="18"/>
+                <w:u w:val="none"/>
+                <w:lang w:val="en-US" w:eastAsia="zh-CN" w:bidi="ar"/>
+              </w:rPr>
+              <w:t>&lt;zjzyx&gt;</w:t>
+            </w:r>
           </w:p>
         </w:tc>
       </w:tr>
@@ -716,11 +782,11 @@
           </w:tblCellMar>
         </w:tblPrEx>
         <w:trPr>
-          <w:trHeight w:val="446" w:hRule="atLeast"/>
+          <w:trHeight w:val="356" w:hRule="atLeast"/>
         </w:trPr>
         <w:tc>
           <w:tcPr>
-            <w:tcW w:w="4260" w:type="dxa"/>
+            <w:tcW w:w="4336" w:type="dxa"/>
             <w:gridSpan w:val="3"/>
           </w:tcPr>
           <w:p>
@@ -743,7 +809,7 @@
         </w:tc>
         <w:tc>
           <w:tcPr>
-            <w:tcW w:w="4262" w:type="dxa"/>
+            <w:tcW w:w="4186" w:type="dxa"/>
             <w:gridSpan w:val="2"/>
             <w:shd w:val="clear" w:color="auto" w:fill="auto"/>
             <w:vAlign w:val="top"/>
@@ -785,49 +851,93 @@
           </w:tblCellMar>
         </w:tblPrEx>
         <w:trPr>
-          <w:trHeight w:val="1929" w:hRule="atLeast"/>
+          <w:trHeight w:val="1679" w:hRule="atLeast"/>
         </w:trPr>
         <w:tc>
           <w:tcPr>
-            <w:tcW w:w="4260" w:type="dxa"/>
+            <w:tcW w:w="4336" w:type="dxa"/>
             <w:gridSpan w:val="3"/>
           </w:tcPr>
           <w:p>
             <w:pPr>
               <w:rPr>
-                <w:rFonts w:hint="eastAsia" w:eastAsiaTheme="minorEastAsia"/>
-                <w:vertAlign w:val="baseline"/>
-                <w:lang w:val="en-US" w:eastAsia="zh-CN"/>
-              </w:rPr>
-            </w:pPr>
-            <w:r>
-              <w:rPr>
-                <w:rFonts w:hint="eastAsia"/>
-                <w:vertAlign w:val="baseline"/>
-                <w:lang w:val="en-US" w:eastAsia="zh-CN"/>
-              </w:rPr>
-              <w:t>多张图片</w:t>
-            </w:r>
-          </w:p>
-        </w:tc>
-        <w:tc>
-          <w:tcPr>
-            <w:tcW w:w="4262" w:type="dxa"/>
+                <w:rFonts w:hint="default" w:eastAsiaTheme="minorEastAsia"/>
+                <w:vertAlign w:val="baseline"/>
+                <w:lang w:val="en-US" w:eastAsia="zh-CN"/>
+              </w:rPr>
+            </w:pPr>
+            <w:r>
+              <w:rPr>
+                <w:rFonts w:hint="eastAsia"/>
+                <w:vertAlign w:val="baseline"/>
+                <w:lang w:val="en-US" w:eastAsia="zh-CN"/>
+              </w:rPr>
+              <w:t>&lt;hgz&gt;</w:t>
+            </w:r>
+          </w:p>
+        </w:tc>
+        <w:tc>
+          <w:tcPr>
+            <w:tcW w:w="4186" w:type="dxa"/>
             <w:gridSpan w:val="2"/>
           </w:tcPr>
           <w:p>
             <w:pPr>
               <w:rPr>
-                <w:vertAlign w:val="baseline"/>
-              </w:rPr>
-            </w:pPr>
-            <w:r>
-              <w:rPr>
-                <w:rFonts w:hint="eastAsia"/>
-                <w:vertAlign w:val="baseline"/>
-                <w:lang w:val="en-US" w:eastAsia="zh-CN"/>
-              </w:rPr>
-              <w:t>多张图片</w:t>
+                <w:rFonts w:hint="default"/>
+                <w:vertAlign w:val="baseline"/>
+                <w:lang w:val="en-US"/>
+              </w:rPr>
+            </w:pPr>
+            <w:r>
+              <w:rPr>
+                <w:rFonts w:hint="eastAsia"/>
+                <w:vertAlign w:val="baseline"/>
+                <w:lang w:val="en-US" w:eastAsia="zh-CN"/>
+              </w:rPr>
+              <w:t>&lt;tzryzyz&gt;</w:t>
+            </w:r>
+          </w:p>
+        </w:tc>
+      </w:tr>
+      <w:tr>
+        <w:tblPrEx>
+          <w:tblBorders>
+            <w:top w:val="single" w:color="auto" w:sz="4" w:space="0"/>
+            <w:left w:val="single" w:color="auto" w:sz="4" w:space="0"/>
+            <w:bottom w:val="single" w:color="auto" w:sz="4" w:space="0"/>
+            <w:right w:val="single" w:color="auto" w:sz="4" w:space="0"/>
+            <w:insideH w:val="single" w:color="auto" w:sz="4" w:space="0"/>
+            <w:insideV w:val="single" w:color="auto" w:sz="4" w:space="0"/>
+          </w:tblBorders>
+          <w:tblCellMar>
+            <w:top w:w="0" w:type="dxa"/>
+            <w:left w:w="108" w:type="dxa"/>
+            <w:bottom w:w="0" w:type="dxa"/>
+            <w:right w:w="108" w:type="dxa"/>
+          </w:tblCellMar>
+        </w:tblPrEx>
+        <w:tc>
+          <w:tcPr>
+            <w:tcW w:w="8522" w:type="dxa"/>
+            <w:gridSpan w:val="5"/>
+          </w:tcPr>
+          <w:p>
+            <w:pPr>
+              <w:jc w:val="center"/>
+              <w:rPr>
+                <w:rFonts w:hint="default" w:eastAsiaTheme="minorEastAsia"/>
+                <w:vertAlign w:val="baseline"/>
+                <w:lang w:val="en-US" w:eastAsia="zh-CN"/>
+              </w:rPr>
+            </w:pPr>
+            <w:r>
+              <w:rPr>
+                <w:rFonts w:hint="eastAsia"/>
+                <w:vertAlign w:val="baseline"/>
+                <w:lang w:val="en-US" w:eastAsia="zh-CN"/>
+              </w:rPr>
+              <w:t>现场焊接技能考试</w:t>
             </w:r>
           </w:p>
         </w:tc>
@@ -850,49 +960,28 @@
           </w:tblCellMar>
         </w:tblPrEx>
         <w:trPr>
-          <w:trHeight w:val="277" w:hRule="atLeast"/>
+          <w:trHeight w:val="1776" w:hRule="atLeast"/>
         </w:trPr>
         <w:tc>
           <w:tcPr>
-            <w:tcW w:w="4260" w:type="dxa"/>
-            <w:gridSpan w:val="3"/>
-          </w:tcPr>
-          <w:p>
-            <w:pPr>
-              <w:rPr>
-                <w:rFonts w:hint="default" w:eastAsiaTheme="minorEastAsia"/>
-                <w:vertAlign w:val="baseline"/>
-                <w:lang w:val="en-US" w:eastAsia="zh-CN"/>
-              </w:rPr>
-            </w:pPr>
-            <w:r>
-              <w:rPr>
-                <w:rFonts w:hint="eastAsia"/>
-                <w:vertAlign w:val="baseline"/>
-                <w:lang w:val="en-US" w:eastAsia="zh-CN"/>
-              </w:rPr>
-              <w:t>符合/不符合</w:t>
-            </w:r>
-          </w:p>
-        </w:tc>
-        <w:tc>
-          <w:tcPr>
-            <w:tcW w:w="4262" w:type="dxa"/>
-            <w:gridSpan w:val="2"/>
-          </w:tcPr>
-          <w:p>
-            <w:pPr>
-              <w:rPr>
-                <w:vertAlign w:val="baseline"/>
-              </w:rPr>
-            </w:pPr>
-            <w:r>
-              <w:rPr>
-                <w:rFonts w:hint="eastAsia"/>
-                <w:vertAlign w:val="baseline"/>
-                <w:lang w:val="en-US" w:eastAsia="zh-CN"/>
-              </w:rPr>
-              <w:t>符合/不符合</w:t>
+            <w:tcW w:w="8522" w:type="dxa"/>
+            <w:gridSpan w:val="5"/>
+          </w:tcPr>
+          <w:p>
+            <w:pPr>
+              <w:rPr>
+                <w:rFonts w:hint="default" w:eastAsiaTheme="minorEastAsia"/>
+                <w:vertAlign w:val="baseline"/>
+                <w:lang w:val="en-US" w:eastAsia="zh-CN"/>
+              </w:rPr>
+            </w:pPr>
+            <w:r>
+              <w:rPr>
+                <w:rFonts w:hint="eastAsia"/>
+                <w:vertAlign w:val="baseline"/>
+                <w:lang w:val="en-US" w:eastAsia="zh-CN"/>
+              </w:rPr>
+              <w:t>&lt;hjks&gt;</w:t>
             </w:r>
           </w:p>
         </w:tc>
@@ -916,24 +1005,177 @@
         </w:tblPrEx>
         <w:tc>
           <w:tcPr>
-            <w:tcW w:w="8522" w:type="dxa"/>
-            <w:gridSpan w:val="5"/>
-          </w:tcPr>
-          <w:p>
-            <w:pPr>
-              <w:rPr>
-                <w:rFonts w:hint="default" w:eastAsiaTheme="minorEastAsia"/>
-                <w:vertAlign w:val="baseline"/>
-                <w:lang w:val="en-US" w:eastAsia="zh-CN"/>
-              </w:rPr>
-            </w:pPr>
-            <w:r>
-              <w:rPr>
-                <w:rFonts w:hint="eastAsia"/>
-                <w:vertAlign w:val="baseline"/>
-                <w:lang w:val="en-US" w:eastAsia="zh-CN"/>
-              </w:rPr>
-              <w:t>现场焊接技能考试</w:t>
+            <w:tcW w:w="3176" w:type="dxa"/>
+            <w:gridSpan w:val="2"/>
+          </w:tcPr>
+          <w:p>
+            <w:pPr>
+              <w:rPr>
+                <w:rFonts w:hint="default" w:eastAsiaTheme="minorEastAsia"/>
+                <w:vertAlign w:val="baseline"/>
+                <w:lang w:val="en-US" w:eastAsia="zh-CN"/>
+              </w:rPr>
+            </w:pPr>
+            <w:r>
+              <w:rPr>
+                <w:rFonts w:hint="eastAsia"/>
+                <w:vertAlign w:val="baseline"/>
+                <w:lang w:val="en-US" w:eastAsia="zh-CN"/>
+              </w:rPr>
+              <w:t>&lt;hgl&gt;</w:t>
+            </w:r>
+          </w:p>
+        </w:tc>
+        <w:tc>
+          <w:tcPr>
+            <w:tcW w:w="3229" w:type="dxa"/>
+            <w:gridSpan w:val="2"/>
+          </w:tcPr>
+          <w:p>
+            <w:pPr>
+              <w:rPr>
+                <w:rFonts w:hint="default" w:eastAsiaTheme="minorEastAsia"/>
+                <w:vertAlign w:val="baseline"/>
+                <w:lang w:val="en-US" w:eastAsia="zh-CN"/>
+              </w:rPr>
+            </w:pPr>
+            <w:r>
+              <w:rPr>
+                <w:rFonts w:hint="eastAsia"/>
+                <w:vertAlign w:val="baseline"/>
+                <w:lang w:val="en-US" w:eastAsia="zh-CN"/>
+              </w:rPr>
+              <w:t>缺陷问题：&lt;qx&gt;</w:t>
+            </w:r>
+          </w:p>
+        </w:tc>
+        <w:tc>
+          <w:tcPr>
+            <w:tcW w:w="2117" w:type="dxa"/>
+          </w:tcPr>
+          <w:p>
+            <w:pPr>
+              <w:rPr>
+                <w:rFonts w:hint="default"/>
+                <w:vertAlign w:val="baseline"/>
+                <w:lang w:val="en-US" w:eastAsia="zh-CN"/>
+              </w:rPr>
+            </w:pPr>
+            <w:r>
+              <w:rPr>
+                <w:rFonts w:hint="eastAsia"/>
+                <w:vertAlign w:val="baseline"/>
+                <w:lang w:val="en-US" w:eastAsia="zh-CN"/>
+              </w:rPr>
+              <w:t>是否补考：&lt;bk&gt;</w:t>
+            </w:r>
+          </w:p>
+        </w:tc>
+      </w:tr>
+      <w:tr>
+        <w:tblPrEx>
+          <w:tblBorders>
+            <w:top w:val="single" w:color="auto" w:sz="4" w:space="0"/>
+            <w:left w:val="single" w:color="auto" w:sz="4" w:space="0"/>
+            <w:bottom w:val="single" w:color="auto" w:sz="4" w:space="0"/>
+            <w:right w:val="single" w:color="auto" w:sz="4" w:space="0"/>
+            <w:insideH w:val="single" w:color="auto" w:sz="4" w:space="0"/>
+            <w:insideV w:val="single" w:color="auto" w:sz="4" w:space="0"/>
+          </w:tblBorders>
+          <w:tblCellMar>
+            <w:top w:w="0" w:type="dxa"/>
+            <w:left w:w="108" w:type="dxa"/>
+            <w:bottom w:w="0" w:type="dxa"/>
+            <w:right w:w="108" w:type="dxa"/>
+          </w:tblCellMar>
+        </w:tblPrEx>
+        <w:tc>
+          <w:tcPr>
+            <w:tcW w:w="1420" w:type="dxa"/>
+          </w:tcPr>
+          <w:p>
+            <w:pPr>
+              <w:rPr>
+                <w:rFonts w:hint="default" w:eastAsiaTheme="minorEastAsia"/>
+                <w:vertAlign w:val="baseline"/>
+                <w:lang w:val="en-US" w:eastAsia="zh-CN"/>
+              </w:rPr>
+            </w:pPr>
+            <w:r>
+              <w:rPr>
+                <w:rFonts w:hint="eastAsia"/>
+                <w:vertAlign w:val="baseline"/>
+                <w:lang w:val="en-US" w:eastAsia="zh-CN"/>
+              </w:rPr>
+              <w:t>是否探伤</w:t>
+            </w:r>
+          </w:p>
+        </w:tc>
+        <w:tc>
+          <w:tcPr>
+            <w:tcW w:w="2916" w:type="dxa"/>
+            <w:gridSpan w:val="2"/>
+          </w:tcPr>
+          <w:p>
+            <w:pPr>
+              <w:rPr>
+                <w:rFonts w:hint="default" w:eastAsiaTheme="minorEastAsia"/>
+                <w:vertAlign w:val="baseline"/>
+                <w:lang w:val="en-US" w:eastAsia="zh-CN"/>
+              </w:rPr>
+            </w:pPr>
+            <w:r>
+              <w:rPr>
+                <w:rFonts w:hint="eastAsia"/>
+                <w:vertAlign w:val="baseline"/>
+                <w:lang w:val="en-US" w:eastAsia="zh-CN"/>
+              </w:rPr>
+              <w:t>&lt;ts&gt;</w:t>
+            </w:r>
+          </w:p>
+        </w:tc>
+        <w:tc>
+          <w:tcPr>
+            <w:tcW w:w="2069" w:type="dxa"/>
+          </w:tcPr>
+          <w:p>
+            <w:pPr>
+              <w:rPr>
+                <w:rFonts w:hint="default" w:eastAsiaTheme="minorEastAsia"/>
+                <w:vertAlign w:val="baseline"/>
+                <w:lang w:val="en-US" w:eastAsia="zh-CN"/>
+              </w:rPr>
+            </w:pPr>
+            <w:r>
+              <w:rPr>
+                <w:rFonts w:hint="eastAsia"/>
+                <w:vertAlign w:val="baseline"/>
+                <w:lang w:val="en-US" w:eastAsia="zh-CN"/>
+              </w:rPr>
+              <w:t>探伤结果</w:t>
+            </w:r>
+          </w:p>
+        </w:tc>
+        <w:tc>
+          <w:tcPr>
+            <w:tcW w:w="2117" w:type="dxa"/>
+          </w:tcPr>
+          <w:p>
+            <w:pPr>
+              <w:jc w:val="center"/>
+              <w:rPr>
+                <w:rFonts w:hint="default" w:eastAsiaTheme="minorEastAsia"/>
+                <w:vertAlign w:val="baseline"/>
+                <w:lang w:val="en-US" w:eastAsia="zh-CN"/>
+              </w:rPr>
+            </w:pPr>
+            <w:r>
+              <w:rPr>
+                <w:rFonts w:hint="eastAsia"/>
+                <w:vertAlign w:val="baseline"/>
+                <w:lang w:val="en-US" w:eastAsia="zh-CN"/>
+              </w:rPr>
+              <w:t>&lt;jg&gt;</w:t>
             </w:r>
           </w:p>
         </w:tc>
@@ -956,7 +1198,7 @@
           </w:tblCellMar>
         </w:tblPrEx>
         <w:trPr>
-          <w:trHeight w:val="906" w:hRule="atLeast"/>
+          <w:trHeight w:val="1566" w:hRule="atLeast"/>
         </w:trPr>
         <w:tc>
           <w:tcPr>
@@ -966,18 +1208,18 @@
           <w:p>
             <w:pPr>
               <w:rPr>
-                <w:rFonts w:hint="eastAsia" w:eastAsiaTheme="minorEastAsia"/>
-                <w:vertAlign w:val="baseline"/>
-                <w:lang w:val="en-US" w:eastAsia="zh-CN"/>
-              </w:rPr>
-            </w:pPr>
-            <w:r>
-              <w:rPr>
-                <w:rFonts w:hint="eastAsia"/>
-                <w:vertAlign w:val="baseline"/>
-                <w:lang w:val="en-US" w:eastAsia="zh-CN"/>
-              </w:rPr>
-              <w:t>图片</w:t>
+                <w:rFonts w:hint="default" w:eastAsiaTheme="minorEastAsia"/>
+                <w:vertAlign w:val="baseline"/>
+                <w:lang w:val="en-US" w:eastAsia="zh-CN"/>
+              </w:rPr>
+            </w:pPr>
+            <w:r>
+              <w:rPr>
+                <w:rFonts w:hint="eastAsia"/>
+                <w:vertAlign w:val="baseline"/>
+                <w:lang w:val="en-US" w:eastAsia="zh-CN"/>
+              </w:rPr>
+              <w:t>&lt;tszp&gt;</w:t>
             </w:r>
           </w:p>
         </w:tc>
@@ -1001,157 +1243,25 @@
         </w:tblPrEx>
         <w:tc>
           <w:tcPr>
-            <w:tcW w:w="1660" w:type="dxa"/>
-            <w:gridSpan w:val="2"/>
-          </w:tcPr>
-          <w:p>
-            <w:pPr>
-              <w:rPr>
-                <w:rFonts w:hint="default" w:eastAsiaTheme="minorEastAsia"/>
-                <w:vertAlign w:val="baseline"/>
-                <w:lang w:val="en-US" w:eastAsia="zh-CN"/>
-              </w:rPr>
-            </w:pPr>
-            <w:r>
-              <w:rPr>
-                <w:rFonts w:hint="eastAsia"/>
-                <w:vertAlign w:val="baseline"/>
-                <w:lang w:val="en-US" w:eastAsia="zh-CN"/>
-              </w:rPr>
-              <w:t>合格/不合格</w:t>
-            </w:r>
-          </w:p>
-        </w:tc>
-        <w:tc>
-          <w:tcPr>
-            <w:tcW w:w="4745" w:type="dxa"/>
-            <w:gridSpan w:val="2"/>
-          </w:tcPr>
-          <w:p>
-            <w:pPr>
-              <w:rPr>
-                <w:rFonts w:hint="default" w:eastAsiaTheme="minorEastAsia"/>
-                <w:vertAlign w:val="baseline"/>
-                <w:lang w:val="en-US" w:eastAsia="zh-CN"/>
-              </w:rPr>
-            </w:pPr>
-            <w:r>
-              <w:rPr>
-                <w:rFonts w:hint="eastAsia"/>
-                <w:vertAlign w:val="baseline"/>
-                <w:lang w:val="en-US" w:eastAsia="zh-CN"/>
-              </w:rPr>
-              <w:t>缺陷问题：</w:t>
-            </w:r>
-          </w:p>
-        </w:tc>
-        <w:tc>
-          <w:tcPr>
-            <w:tcW w:w="2117" w:type="dxa"/>
-          </w:tcPr>
-          <w:p>
-            <w:pPr>
-              <w:rPr>
-                <w:rFonts w:hint="eastAsia"/>
-                <w:vertAlign w:val="baseline"/>
-                <w:lang w:val="en-US" w:eastAsia="zh-CN"/>
-              </w:rPr>
-            </w:pPr>
-            <w:r>
-              <w:rPr>
-                <w:rFonts w:hint="eastAsia"/>
-                <w:vertAlign w:val="baseline"/>
-                <w:lang w:val="en-US" w:eastAsia="zh-CN"/>
-              </w:rPr>
-              <w:t>是否补考：</w:t>
-            </w:r>
-          </w:p>
-        </w:tc>
-      </w:tr>
-      <w:tr>
-        <w:tblPrEx>
-          <w:tblBorders>
-            <w:top w:val="single" w:color="auto" w:sz="4" w:space="0"/>
-            <w:left w:val="single" w:color="auto" w:sz="4" w:space="0"/>
-            <w:bottom w:val="single" w:color="auto" w:sz="4" w:space="0"/>
-            <w:right w:val="single" w:color="auto" w:sz="4" w:space="0"/>
-            <w:insideH w:val="single" w:color="auto" w:sz="4" w:space="0"/>
-            <w:insideV w:val="single" w:color="auto" w:sz="4" w:space="0"/>
-          </w:tblBorders>
-          <w:tblCellMar>
-            <w:top w:w="0" w:type="dxa"/>
-            <w:left w:w="108" w:type="dxa"/>
-            <w:bottom w:w="0" w:type="dxa"/>
-            <w:right w:w="108" w:type="dxa"/>
-          </w:tblCellMar>
-        </w:tblPrEx>
-        <w:tc>
-          <w:tcPr>
-            <w:tcW w:w="1420" w:type="dxa"/>
-          </w:tcPr>
-          <w:p>
-            <w:pPr>
-              <w:rPr>
-                <w:rFonts w:hint="default" w:eastAsiaTheme="minorEastAsia"/>
-                <w:vertAlign w:val="baseline"/>
-                <w:lang w:val="en-US" w:eastAsia="zh-CN"/>
-              </w:rPr>
-            </w:pPr>
-            <w:r>
-              <w:rPr>
-                <w:rFonts w:hint="eastAsia"/>
-                <w:vertAlign w:val="baseline"/>
-                <w:lang w:val="en-US" w:eastAsia="zh-CN"/>
-              </w:rPr>
-              <w:t>是否探伤</w:t>
-            </w:r>
-          </w:p>
-        </w:tc>
-        <w:tc>
-          <w:tcPr>
-            <w:tcW w:w="2840" w:type="dxa"/>
-            <w:gridSpan w:val="2"/>
-          </w:tcPr>
-          <w:p>
-            <w:pPr>
-              <w:rPr>
-                <w:vertAlign w:val="baseline"/>
-              </w:rPr>
-            </w:pPr>
-          </w:p>
-        </w:tc>
-        <w:tc>
-          <w:tcPr>
-            <w:tcW w:w="2145" w:type="dxa"/>
-          </w:tcPr>
-          <w:p>
-            <w:pPr>
-              <w:rPr>
-                <w:rFonts w:hint="default" w:eastAsiaTheme="minorEastAsia"/>
-                <w:vertAlign w:val="baseline"/>
-                <w:lang w:val="en-US" w:eastAsia="zh-CN"/>
-              </w:rPr>
-            </w:pPr>
-            <w:r>
-              <w:rPr>
-                <w:rFonts w:hint="eastAsia"/>
-                <w:vertAlign w:val="baseline"/>
-                <w:lang w:val="en-US" w:eastAsia="zh-CN"/>
-              </w:rPr>
-              <w:t>探伤结果</w:t>
-            </w:r>
-          </w:p>
-        </w:tc>
-        <w:tc>
-          <w:tcPr>
-            <w:tcW w:w="2117" w:type="dxa"/>
-          </w:tcPr>
-          <w:p>
-            <w:pPr>
-              <w:rPr>
-                <w:vertAlign w:val="baseline"/>
-              </w:rPr>
-            </w:pPr>
+            <w:tcW w:w="8522" w:type="dxa"/>
+            <w:gridSpan w:val="5"/>
+          </w:tcPr>
+          <w:p>
+            <w:pPr>
+              <w:rPr>
+                <w:rFonts w:hint="default" w:eastAsiaTheme="minorEastAsia"/>
+                <w:vertAlign w:val="baseline"/>
+                <w:lang w:val="en-US" w:eastAsia="zh-CN"/>
+              </w:rPr>
+            </w:pPr>
+            <w:r>
+              <w:rPr>
+                <w:rFonts w:hint="eastAsia"/>
+                <w:vertAlign w:val="baseline"/>
+                <w:lang w:val="en-US" w:eastAsia="zh-CN"/>
+              </w:rPr>
+              <w:t>结论：&lt;jl&gt;</w:t>
+            </w:r>
           </w:p>
         </w:tc>
       </w:tr>
@@ -1173,7 +1283,7 @@
           </w:tblCellMar>
         </w:tblPrEx>
         <w:trPr>
-          <w:trHeight w:val="906" w:hRule="atLeast"/>
+          <w:trHeight w:val="2204" w:hRule="atLeast"/>
         </w:trPr>
         <w:tc>
           <w:tcPr>
@@ -1183,112 +1293,26 @@
           <w:p>
             <w:pPr>
               <w:rPr>
-                <w:rFonts w:hint="eastAsia" w:eastAsiaTheme="minorEastAsia"/>
-                <w:vertAlign w:val="baseline"/>
-                <w:lang w:val="en-US" w:eastAsia="zh-CN"/>
-              </w:rPr>
-            </w:pPr>
-            <w:r>
-              <w:rPr>
-                <w:rFonts w:hint="eastAsia"/>
-                <w:vertAlign w:val="baseline"/>
-                <w:lang w:val="en-US" w:eastAsia="zh-CN"/>
-              </w:rPr>
-              <w:t>图片</w:t>
-            </w:r>
-          </w:p>
-        </w:tc>
-      </w:tr>
-      <w:tr>
-        <w:tblPrEx>
-          <w:tblBorders>
-            <w:top w:val="single" w:color="auto" w:sz="4" w:space="0"/>
-            <w:left w:val="single" w:color="auto" w:sz="4" w:space="0"/>
-            <w:bottom w:val="single" w:color="auto" w:sz="4" w:space="0"/>
-            <w:right w:val="single" w:color="auto" w:sz="4" w:space="0"/>
-            <w:insideH w:val="single" w:color="auto" w:sz="4" w:space="0"/>
-            <w:insideV w:val="single" w:color="auto" w:sz="4" w:space="0"/>
-          </w:tblBorders>
-          <w:tblCellMar>
-            <w:top w:w="0" w:type="dxa"/>
-            <w:left w:w="108" w:type="dxa"/>
-            <w:bottom w:w="0" w:type="dxa"/>
-            <w:right w:w="108" w:type="dxa"/>
-          </w:tblCellMar>
-        </w:tblPrEx>
-        <w:tc>
-          <w:tcPr>
-            <w:tcW w:w="8522" w:type="dxa"/>
-            <w:gridSpan w:val="5"/>
-          </w:tcPr>
-          <w:p>
-            <w:pPr>
-              <w:rPr>
-                <w:rFonts w:hint="default" w:eastAsiaTheme="minorEastAsia"/>
-                <w:vertAlign w:val="baseline"/>
-                <w:lang w:val="en-US" w:eastAsia="zh-CN"/>
-              </w:rPr>
-            </w:pPr>
-            <w:r>
-              <w:rPr>
-                <w:rFonts w:hint="eastAsia"/>
-                <w:vertAlign w:val="baseline"/>
-                <w:lang w:val="en-US" w:eastAsia="zh-CN"/>
-              </w:rPr>
-              <w:t>考试通过/不通过</w:t>
-            </w:r>
-          </w:p>
-        </w:tc>
-      </w:tr>
-      <w:tr>
-        <w:tblPrEx>
-          <w:tblBorders>
-            <w:top w:val="single" w:color="auto" w:sz="4" w:space="0"/>
-            <w:left w:val="single" w:color="auto" w:sz="4" w:space="0"/>
-            <w:bottom w:val="single" w:color="auto" w:sz="4" w:space="0"/>
-            <w:right w:val="single" w:color="auto" w:sz="4" w:space="0"/>
-            <w:insideH w:val="single" w:color="auto" w:sz="4" w:space="0"/>
-            <w:insideV w:val="single" w:color="auto" w:sz="4" w:space="0"/>
-          </w:tblBorders>
-          <w:tblCellMar>
-            <w:top w:w="0" w:type="dxa"/>
-            <w:left w:w="108" w:type="dxa"/>
-            <w:bottom w:w="0" w:type="dxa"/>
-            <w:right w:w="108" w:type="dxa"/>
-          </w:tblCellMar>
-        </w:tblPrEx>
-        <w:trPr>
-          <w:trHeight w:val="2134" w:hRule="atLeast"/>
-        </w:trPr>
-        <w:tc>
-          <w:tcPr>
-            <w:tcW w:w="8522" w:type="dxa"/>
-            <w:gridSpan w:val="5"/>
-          </w:tcPr>
-          <w:p>
-            <w:pPr>
-              <w:rPr>
-                <w:rFonts w:hint="eastAsia" w:eastAsiaTheme="minorEastAsia"/>
-                <w:vertAlign w:val="baseline"/>
-                <w:lang w:val="en-US" w:eastAsia="zh-CN"/>
-              </w:rPr>
-            </w:pPr>
-            <w:r>
-              <w:rPr>
-                <w:rFonts w:hint="eastAsia"/>
-                <w:vertAlign w:val="baseline"/>
-                <w:lang w:val="en-US" w:eastAsia="zh-CN"/>
-              </w:rPr>
-              <w:t>图片（焊工卡）</w:t>
-            </w:r>
+                <w:rFonts w:hint="default" w:eastAsiaTheme="minorEastAsia"/>
+                <w:vertAlign w:val="baseline"/>
+                <w:lang w:val="en-US" w:eastAsia="zh-CN"/>
+              </w:rPr>
+            </w:pPr>
+            <w:bookmarkStart w:id="0" w:name="_GoBack"/>
+            <w:r>
+              <w:rPr>
+                <w:rFonts w:hint="eastAsia"/>
+                <w:vertAlign w:val="baseline"/>
+                <w:lang w:val="en-US" w:eastAsia="zh-CN"/>
+              </w:rPr>
+              <w:t>&lt;hgk&gt;</w:t>
+            </w:r>
+            <w:bookmarkEnd w:id="0"/>
           </w:p>
         </w:tc>
       </w:tr>
     </w:tbl>
-    <w:p>
-      <w:bookmarkStart w:id="0" w:name="_GoBack"/>
-      <w:bookmarkEnd w:id="0"/>
-    </w:p>
+    <w:p/>
     <w:sectPr>
       <w:pgSz w:w="11906" w:h="16838"/>
       <w:pgMar w:top="1440" w:right="1800" w:bottom="1440" w:left="1800" w:header="851" w:footer="992" w:gutter="0"/>
@@ -1413,7 +1437,7 @@
     <w:lsdException w:unhideWhenUsed="0" w:uiPriority="0" w:semiHidden="0" w:name="HTML Sample"/>
     <w:lsdException w:unhideWhenUsed="0" w:uiPriority="0" w:semiHidden="0" w:name="HTML Typewriter"/>
     <w:lsdException w:unhideWhenUsed="0" w:uiPriority="0" w:semiHidden="0" w:name="HTML Variable"/>
-    <w:lsdException w:unhideWhenUsed="0" w:uiPriority="0" w:name="Normal Table"/>
+    <w:lsdException w:qFormat="1" w:unhideWhenUsed="0" w:uiPriority="0" w:name="Normal Table"/>
     <w:lsdException w:unhideWhenUsed="0" w:uiPriority="0" w:semiHidden="0" w:name="annotation subject"/>
     <w:lsdException w:unhideWhenUsed="0" w:uiPriority="0" w:semiHidden="0" w:name="Table Simple 1"/>
     <w:lsdException w:unhideWhenUsed="0" w:uiPriority="0" w:semiHidden="0" w:name="Table Simple 2"/>
@@ -1584,6 +1608,7 @@
   <w:style w:type="table" w:default="1" w:styleId="2">
     <w:name w:val="Normal Table"/>
     <w:semiHidden/>
+    <w:qFormat/>
     <w:uiPriority w:val="0"/>
     <w:tblPr>
       <w:tblCellMar>
@@ -1617,6 +1642,7 @@
   <w:style w:type="character" w:customStyle="1" w:styleId="5">
     <w:name w:val="font31"/>
     <w:basedOn w:val="4"/>
+    <w:qFormat/>
     <w:uiPriority w:val="0"/>
     <w:rPr>
       <w:rFonts w:hint="eastAsia" w:ascii="等线" w:hAnsi="等线" w:eastAsia="等线" w:cs="等线"/>
@@ -1631,6 +1657,7 @@
   <w:style w:type="character" w:customStyle="1" w:styleId="6">
     <w:name w:val="font41"/>
     <w:basedOn w:val="4"/>
+    <w:qFormat/>
     <w:uiPriority w:val="0"/>
     <w:rPr>
       <w:rFonts w:hint="eastAsia" w:ascii="等线" w:hAnsi="等线" w:eastAsia="等线" w:cs="等线"/>

</xml_diff>